<commit_message>
teszt doksi tartalmilag kesz, formazottat felrakok másik peldanyban
</commit_message>
<xml_diff>
--- a/doc/teszteloi_es_felhasznaloi_dokumentacio/projekt_teszteles_dokumentacio.docx
+++ b/doc/teszteloi_es_felhasznaloi_dokumentacio/projekt_teszteles_dokumentacio.docx
@@ -1592,6 +1592,12 @@
       <w:proofErr w:type="spellEnd"/>
       <w:r>
         <w:t xml:space="preserve"> hála rengeteg időt, illetve humán erőforrást sikerült megspórolni. A következő oldalakon található részletes tesztelési jegyzőkönyv pontról, pontra bemutatja azokat a teszteseteket, amelyek alátámasztják a fenti megállapításokat.</w:t>
+      </w:r>
+    </w:p>
+    <w:p>
+      <w:r>
+        <w:lastRenderedPageBreak/>
+        <w:t xml:space="preserve"> </w:t>
       </w:r>
     </w:p>
     <w:p/>
@@ -1602,8 +1608,28 @@
     <w:p/>
     <w:p/>
     <w:p/>
-    <w:p>
-      <w:pPr>
+    <w:p/>
+    <w:p/>
+    <w:p/>
+    <w:p/>
+    <w:p/>
+    <w:p/>
+    <w:p/>
+    <w:p/>
+    <w:p/>
+    <w:p/>
+    <w:p/>
+    <w:p/>
+    <w:p/>
+    <w:p/>
+    <w:p/>
+    <w:p/>
+    <w:p/>
+    <w:p>
+      <w:pPr>
+        <w:tabs>
+          <w:tab w:val="left" w:pos="1104"/>
+        </w:tabs>
         <w:sectPr>
           <w:pgSz w:w="11906" w:h="16838"/>
           <w:pgMar w:top="1417" w:right="1417" w:bottom="1417" w:left="1417" w:header="708" w:footer="708" w:gutter="0"/>
@@ -1611,8 +1637,10 @@
           <w:docGrid w:linePitch="360"/>
         </w:sectPr>
       </w:pPr>
-    </w:p>
-    <w:p/>
+      <w:r>
+        <w:tab/>
+      </w:r>
+    </w:p>
     <w:tbl>
       <w:tblPr>
         <w:tblStyle w:val="Rcsostblzat"/>

</xml_diff>